<commit_message>
Custom Login and Registration by using Spring Security.
</commit_message>
<xml_diff>
--- a/Spring Security Fundamentals.docx
+++ b/Spring Security Fundamentals.docx
@@ -3625,6 +3625,20 @@
     </w:p>
     <w:p>
       <w:pPr>
+        <w:pStyle w:val="Heading2"/>
+        <w:rPr>
+          <w:noProof/>
+        </w:rPr>
+      </w:pPr>
+      <w:r>
+        <w:rPr>
+          <w:noProof/>
+        </w:rPr>
+        <w:t>Secure API:</w:t>
+      </w:r>
+    </w:p>
+    <w:p>
+      <w:pPr>
         <w:rPr>
           <w:noProof/>
         </w:rPr>
@@ -3681,6 +3695,133 @@
         </w:rPr>
         <w:br/>
         <w:t>&lt;/dependency&gt;</w:t>
+      </w:r>
+      <w:r>
+        <w:rPr>
+          <w:i/>
+          <w:iCs/>
+        </w:rPr>
+        <w:br/>
+      </w:r>
+    </w:p>
+    <w:p>
+      <w:pPr>
+        <w:rPr>
+          <w:b/>
+          <w:bCs/>
+        </w:rPr>
+      </w:pPr>
+      <w:r>
+        <w:rPr>
+          <w:b/>
+          <w:bCs/>
+        </w:rPr>
+        <w:t>User and Role Model and there Mapping</w:t>
+      </w:r>
+      <w:r>
+        <w:rPr>
+          <w:b/>
+          <w:bCs/>
+        </w:rPr>
+        <w:t>:</w:t>
+      </w:r>
+    </w:p>
+    <w:p>
+      <w:pPr>
+        <w:rPr>
+          <w:b/>
+          <w:bCs/>
+        </w:rPr>
+      </w:pPr>
+      <w:r>
+        <w:rPr>
+          <w:noProof/>
+        </w:rPr>
+        <w:lastRenderedPageBreak/>
+        <w:drawing>
+          <wp:inline distT="0" distB="0" distL="0" distR="0" wp14:anchorId="2F9D389D" wp14:editId="2BDB4F51">
+            <wp:extent cx="5943600" cy="4328795"/>
+            <wp:effectExtent l="0" t="0" r="0" b="0"/>
+            <wp:docPr id="1542723784" name="Picture 1"/>
+            <wp:cNvGraphicFramePr>
+              <a:graphicFrameLocks xmlns:a="http://schemas.openxmlformats.org/drawingml/2006/main" noChangeAspect="1"/>
+            </wp:cNvGraphicFramePr>
+            <a:graphic xmlns:a="http://schemas.openxmlformats.org/drawingml/2006/main">
+              <a:graphicData uri="http://schemas.openxmlformats.org/drawingml/2006/picture">
+                <pic:pic xmlns:pic="http://schemas.openxmlformats.org/drawingml/2006/picture">
+                  <pic:nvPicPr>
+                    <pic:cNvPr id="1542723784" name=""/>
+                    <pic:cNvPicPr/>
+                  </pic:nvPicPr>
+                  <pic:blipFill>
+                    <a:blip r:embed="rId62"/>
+                    <a:stretch>
+                      <a:fillRect/>
+                    </a:stretch>
+                  </pic:blipFill>
+                  <pic:spPr>
+                    <a:xfrm>
+                      <a:off x="0" y="0"/>
+                      <a:ext cx="5943600" cy="4328795"/>
+                    </a:xfrm>
+                    <a:prstGeom prst="rect">
+                      <a:avLst/>
+                    </a:prstGeom>
+                  </pic:spPr>
+                </pic:pic>
+              </a:graphicData>
+            </a:graphic>
+          </wp:inline>
+        </w:drawing>
+      </w:r>
+    </w:p>
+    <w:p>
+      <w:pPr>
+        <w:rPr>
+          <w:b/>
+          <w:bCs/>
+        </w:rPr>
+      </w:pPr>
+      <w:r>
+        <w:rPr>
+          <w:noProof/>
+        </w:rPr>
+        <w:lastRenderedPageBreak/>
+        <w:drawing>
+          <wp:inline distT="0" distB="0" distL="0" distR="0" wp14:anchorId="371F9A4A" wp14:editId="526EDB27">
+            <wp:extent cx="4610100" cy="5124450"/>
+            <wp:effectExtent l="0" t="0" r="0" b="0"/>
+            <wp:docPr id="121861463" name="Picture 1"/>
+            <wp:cNvGraphicFramePr>
+              <a:graphicFrameLocks xmlns:a="http://schemas.openxmlformats.org/drawingml/2006/main" noChangeAspect="1"/>
+            </wp:cNvGraphicFramePr>
+            <a:graphic xmlns:a="http://schemas.openxmlformats.org/drawingml/2006/main">
+              <a:graphicData uri="http://schemas.openxmlformats.org/drawingml/2006/picture">
+                <pic:pic xmlns:pic="http://schemas.openxmlformats.org/drawingml/2006/picture">
+                  <pic:nvPicPr>
+                    <pic:cNvPr id="121861463" name=""/>
+                    <pic:cNvPicPr/>
+                  </pic:nvPicPr>
+                  <pic:blipFill>
+                    <a:blip r:embed="rId63"/>
+                    <a:stretch>
+                      <a:fillRect/>
+                    </a:stretch>
+                  </pic:blipFill>
+                  <pic:spPr>
+                    <a:xfrm>
+                      <a:off x="0" y="0"/>
+                      <a:ext cx="4610100" cy="5124450"/>
+                    </a:xfrm>
+                    <a:prstGeom prst="rect">
+                      <a:avLst/>
+                    </a:prstGeom>
+                  </pic:spPr>
+                </pic:pic>
+              </a:graphicData>
+            </a:graphic>
+          </wp:inline>
+        </w:drawing>
       </w:r>
     </w:p>
     <w:p>
@@ -3731,6 +3872,11 @@
       </w:r>
     </w:p>
     <w:p>
+      <w:r>
+        <w:t>Isliye hm email(username) pass kr ke data get kr rhe he database me se or pass work rhe he spring boot User class ko.</w:t>
+      </w:r>
+    </w:p>
+    <w:p>
       <w:pPr>
         <w:rPr>
           <w:b/>
@@ -3758,7 +3904,7 @@
                     <pic:cNvPicPr/>
                   </pic:nvPicPr>
                   <pic:blipFill>
-                    <a:blip r:embed="rId62"/>
+                    <a:blip r:embed="rId64"/>
                     <a:stretch>
                       <a:fillRect/>
                     </a:stretch>
@@ -3814,7 +3960,7 @@
                     <pic:cNvPicPr/>
                   </pic:nvPicPr>
                   <pic:blipFill>
-                    <a:blip r:embed="rId63"/>
+                    <a:blip r:embed="rId65"/>
                     <a:stretch>
                       <a:fillRect/>
                     </a:stretch>
@@ -3857,7 +4003,7 @@
                     <pic:cNvPicPr/>
                   </pic:nvPicPr>
                   <pic:blipFill>
-                    <a:blip r:embed="rId64"/>
+                    <a:blip r:embed="rId66"/>
                     <a:stretch>
                       <a:fillRect/>
                     </a:stretch>
@@ -3878,6 +4024,1031 @@
         </w:drawing>
       </w:r>
     </w:p>
+    <w:p>
+      <w:pPr>
+        <w:pStyle w:val="Heading1"/>
+      </w:pPr>
+      <w:r>
+        <w:t>Secure a WebApp:</w:t>
+      </w:r>
+    </w:p>
+    <w:p>
+      <w:pPr>
+        <w:rPr>
+          <w:b/>
+          <w:bCs/>
+        </w:rPr>
+      </w:pPr>
+      <w:r>
+        <w:rPr>
+          <w:b/>
+          <w:bCs/>
+        </w:rPr>
+        <w:t>Thymeleaf Dependency:</w:t>
+      </w:r>
+    </w:p>
+    <w:p>
+      <w:pPr>
+        <w:rPr>
+          <w:b/>
+          <w:bCs/>
+        </w:rPr>
+      </w:pPr>
+      <w:r>
+        <w:rPr>
+          <w:noProof/>
+        </w:rPr>
+        <w:drawing>
+          <wp:inline distT="0" distB="0" distL="0" distR="0" wp14:anchorId="0ABA642C" wp14:editId="17868BE4">
+            <wp:extent cx="5943600" cy="1878965"/>
+            <wp:effectExtent l="0" t="0" r="0" b="6985"/>
+            <wp:docPr id="2039924799" name="Picture 1"/>
+            <wp:cNvGraphicFramePr>
+              <a:graphicFrameLocks xmlns:a="http://schemas.openxmlformats.org/drawingml/2006/main" noChangeAspect="1"/>
+            </wp:cNvGraphicFramePr>
+            <a:graphic xmlns:a="http://schemas.openxmlformats.org/drawingml/2006/main">
+              <a:graphicData uri="http://schemas.openxmlformats.org/drawingml/2006/picture">
+                <pic:pic xmlns:pic="http://schemas.openxmlformats.org/drawingml/2006/picture">
+                  <pic:nvPicPr>
+                    <pic:cNvPr id="2039924799" name=""/>
+                    <pic:cNvPicPr/>
+                  </pic:nvPicPr>
+                  <pic:blipFill>
+                    <a:blip r:embed="rId67"/>
+                    <a:stretch>
+                      <a:fillRect/>
+                    </a:stretch>
+                  </pic:blipFill>
+                  <pic:spPr>
+                    <a:xfrm>
+                      <a:off x="0" y="0"/>
+                      <a:ext cx="5943600" cy="1878965"/>
+                    </a:xfrm>
+                    <a:prstGeom prst="rect">
+                      <a:avLst/>
+                    </a:prstGeom>
+                  </pic:spPr>
+                </pic:pic>
+              </a:graphicData>
+            </a:graphic>
+          </wp:inline>
+        </w:drawing>
+      </w:r>
+    </w:p>
+    <w:p>
+      <w:r>
+        <w:rPr>
+          <w:noProof/>
+        </w:rPr>
+        <w:lastRenderedPageBreak/>
+        <w:drawing>
+          <wp:inline distT="0" distB="0" distL="0" distR="0" wp14:anchorId="619EB3E4" wp14:editId="1EC9E1E7">
+            <wp:extent cx="5943600" cy="2509520"/>
+            <wp:effectExtent l="0" t="0" r="0" b="5080"/>
+            <wp:docPr id="2120766111" name="Picture 1"/>
+            <wp:cNvGraphicFramePr>
+              <a:graphicFrameLocks xmlns:a="http://schemas.openxmlformats.org/drawingml/2006/main" noChangeAspect="1"/>
+            </wp:cNvGraphicFramePr>
+            <a:graphic xmlns:a="http://schemas.openxmlformats.org/drawingml/2006/main">
+              <a:graphicData uri="http://schemas.openxmlformats.org/drawingml/2006/picture">
+                <pic:pic xmlns:pic="http://schemas.openxmlformats.org/drawingml/2006/picture">
+                  <pic:nvPicPr>
+                    <pic:cNvPr id="2120766111" name=""/>
+                    <pic:cNvPicPr/>
+                  </pic:nvPicPr>
+                  <pic:blipFill>
+                    <a:blip r:embed="rId68"/>
+                    <a:stretch>
+                      <a:fillRect/>
+                    </a:stretch>
+                  </pic:blipFill>
+                  <pic:spPr>
+                    <a:xfrm>
+                      <a:off x="0" y="0"/>
+                      <a:ext cx="5943600" cy="2509520"/>
+                    </a:xfrm>
+                    <a:prstGeom prst="rect">
+                      <a:avLst/>
+                    </a:prstGeom>
+                  </pic:spPr>
+                </pic:pic>
+              </a:graphicData>
+            </a:graphic>
+          </wp:inline>
+        </w:drawing>
+      </w:r>
+    </w:p>
+    <w:p>
+      <w:r>
+        <w:rPr>
+          <w:noProof/>
+        </w:rPr>
+        <w:drawing>
+          <wp:inline distT="0" distB="0" distL="0" distR="0" wp14:anchorId="2BA07F3B" wp14:editId="5B759A75">
+            <wp:extent cx="5943600" cy="2425065"/>
+            <wp:effectExtent l="0" t="0" r="0" b="0"/>
+            <wp:docPr id="1088204129" name="Picture 1"/>
+            <wp:cNvGraphicFramePr>
+              <a:graphicFrameLocks xmlns:a="http://schemas.openxmlformats.org/drawingml/2006/main" noChangeAspect="1"/>
+            </wp:cNvGraphicFramePr>
+            <a:graphic xmlns:a="http://schemas.openxmlformats.org/drawingml/2006/main">
+              <a:graphicData uri="http://schemas.openxmlformats.org/drawingml/2006/picture">
+                <pic:pic xmlns:pic="http://schemas.openxmlformats.org/drawingml/2006/picture">
+                  <pic:nvPicPr>
+                    <pic:cNvPr id="1088204129" name=""/>
+                    <pic:cNvPicPr/>
+                  </pic:nvPicPr>
+                  <pic:blipFill>
+                    <a:blip r:embed="rId69"/>
+                    <a:stretch>
+                      <a:fillRect/>
+                    </a:stretch>
+                  </pic:blipFill>
+                  <pic:spPr>
+                    <a:xfrm>
+                      <a:off x="0" y="0"/>
+                      <a:ext cx="5943600" cy="2425065"/>
+                    </a:xfrm>
+                    <a:prstGeom prst="rect">
+                      <a:avLst/>
+                    </a:prstGeom>
+                  </pic:spPr>
+                </pic:pic>
+              </a:graphicData>
+            </a:graphic>
+          </wp:inline>
+        </w:drawing>
+      </w:r>
+    </w:p>
+    <w:p>
+      <w:r>
+        <w:rPr>
+          <w:noProof/>
+        </w:rPr>
+        <w:drawing>
+          <wp:inline distT="0" distB="0" distL="0" distR="0" wp14:anchorId="465F58E8" wp14:editId="52E29046">
+            <wp:extent cx="3048000" cy="1485900"/>
+            <wp:effectExtent l="0" t="0" r="0" b="0"/>
+            <wp:docPr id="1549820237" name="Picture 1"/>
+            <wp:cNvGraphicFramePr>
+              <a:graphicFrameLocks xmlns:a="http://schemas.openxmlformats.org/drawingml/2006/main" noChangeAspect="1"/>
+            </wp:cNvGraphicFramePr>
+            <a:graphic xmlns:a="http://schemas.openxmlformats.org/drawingml/2006/main">
+              <a:graphicData uri="http://schemas.openxmlformats.org/drawingml/2006/picture">
+                <pic:pic xmlns:pic="http://schemas.openxmlformats.org/drawingml/2006/picture">
+                  <pic:nvPicPr>
+                    <pic:cNvPr id="1549820237" name=""/>
+                    <pic:cNvPicPr/>
+                  </pic:nvPicPr>
+                  <pic:blipFill>
+                    <a:blip r:embed="rId70"/>
+                    <a:stretch>
+                      <a:fillRect/>
+                    </a:stretch>
+                  </pic:blipFill>
+                  <pic:spPr>
+                    <a:xfrm>
+                      <a:off x="0" y="0"/>
+                      <a:ext cx="3048000" cy="1485900"/>
+                    </a:xfrm>
+                    <a:prstGeom prst="rect">
+                      <a:avLst/>
+                    </a:prstGeom>
+                  </pic:spPr>
+                </pic:pic>
+              </a:graphicData>
+            </a:graphic>
+          </wp:inline>
+        </w:drawing>
+      </w:r>
+    </w:p>
+    <w:p>
+      <w:r>
+        <w:t xml:space="preserve">Till now we have implemented login and index page. </w:t>
+      </w:r>
+    </w:p>
+    <w:p>
+      <w:r>
+        <w:t>Now we are going to give the permission to the USER and ADMIN role.</w:t>
+      </w:r>
+    </w:p>
+    <w:p>
+      <w:r>
+        <w:t xml:space="preserve">Admin only can create coupon and save it. </w:t>
+      </w:r>
+    </w:p>
+    <w:p>
+      <w:r>
+        <w:t>User role only able to get the coupon details.</w:t>
+      </w:r>
+    </w:p>
+    <w:p>
+      <w:pPr>
+        <w:rPr>
+          <w:noProof/>
+        </w:rPr>
+      </w:pPr>
+      <w:r>
+        <w:rPr>
+          <w:noProof/>
+        </w:rPr>
+        <w:lastRenderedPageBreak/>
+        <w:drawing>
+          <wp:inline distT="0" distB="0" distL="0" distR="0" wp14:anchorId="16EA0911" wp14:editId="2B6A86FA">
+            <wp:extent cx="5600700" cy="5248275"/>
+            <wp:effectExtent l="0" t="0" r="0" b="9525"/>
+            <wp:docPr id="552346121" name="Picture 1"/>
+            <wp:cNvGraphicFramePr>
+              <a:graphicFrameLocks xmlns:a="http://schemas.openxmlformats.org/drawingml/2006/main" noChangeAspect="1"/>
+            </wp:cNvGraphicFramePr>
+            <a:graphic xmlns:a="http://schemas.openxmlformats.org/drawingml/2006/main">
+              <a:graphicData uri="http://schemas.openxmlformats.org/drawingml/2006/picture">
+                <pic:pic xmlns:pic="http://schemas.openxmlformats.org/drawingml/2006/picture">
+                  <pic:nvPicPr>
+                    <pic:cNvPr id="552346121" name=""/>
+                    <pic:cNvPicPr/>
+                  </pic:nvPicPr>
+                  <pic:blipFill>
+                    <a:blip r:embed="rId71"/>
+                    <a:stretch>
+                      <a:fillRect/>
+                    </a:stretch>
+                  </pic:blipFill>
+                  <pic:spPr>
+                    <a:xfrm>
+                      <a:off x="0" y="0"/>
+                      <a:ext cx="5600700" cy="5248275"/>
+                    </a:xfrm>
+                    <a:prstGeom prst="rect">
+                      <a:avLst/>
+                    </a:prstGeom>
+                  </pic:spPr>
+                </pic:pic>
+              </a:graphicData>
+            </a:graphic>
+          </wp:inline>
+        </w:drawing>
+      </w:r>
+      <w:r>
+        <w:rPr>
+          <w:noProof/>
+        </w:rPr>
+        <w:t xml:space="preserve"> </w:t>
+      </w:r>
+      <w:r>
+        <w:rPr>
+          <w:noProof/>
+        </w:rPr>
+        <w:drawing>
+          <wp:inline distT="0" distB="0" distL="0" distR="0" wp14:anchorId="01749F77" wp14:editId="72164230">
+            <wp:extent cx="5448300" cy="1685925"/>
+            <wp:effectExtent l="0" t="0" r="0" b="9525"/>
+            <wp:docPr id="396621543" name="Picture 1"/>
+            <wp:cNvGraphicFramePr>
+              <a:graphicFrameLocks xmlns:a="http://schemas.openxmlformats.org/drawingml/2006/main" noChangeAspect="1"/>
+            </wp:cNvGraphicFramePr>
+            <a:graphic xmlns:a="http://schemas.openxmlformats.org/drawingml/2006/main">
+              <a:graphicData uri="http://schemas.openxmlformats.org/drawingml/2006/picture">
+                <pic:pic xmlns:pic="http://schemas.openxmlformats.org/drawingml/2006/picture">
+                  <pic:nvPicPr>
+                    <pic:cNvPr id="396621543" name=""/>
+                    <pic:cNvPicPr/>
+                  </pic:nvPicPr>
+                  <pic:blipFill>
+                    <a:blip r:embed="rId72"/>
+                    <a:stretch>
+                      <a:fillRect/>
+                    </a:stretch>
+                  </pic:blipFill>
+                  <pic:spPr>
+                    <a:xfrm>
+                      <a:off x="0" y="0"/>
+                      <a:ext cx="5448300" cy="1685925"/>
+                    </a:xfrm>
+                    <a:prstGeom prst="rect">
+                      <a:avLst/>
+                    </a:prstGeom>
+                  </pic:spPr>
+                </pic:pic>
+              </a:graphicData>
+            </a:graphic>
+          </wp:inline>
+        </w:drawing>
+      </w:r>
+    </w:p>
+    <w:p>
+      <w:r>
+        <w:rPr>
+          <w:noProof/>
+        </w:rPr>
+        <w:lastRenderedPageBreak/>
+        <w:drawing>
+          <wp:inline distT="0" distB="0" distL="0" distR="0" wp14:anchorId="10564ACF" wp14:editId="14A2F3E7">
+            <wp:extent cx="5943600" cy="3798570"/>
+            <wp:effectExtent l="0" t="0" r="0" b="0"/>
+            <wp:docPr id="1860025404" name="Picture 1"/>
+            <wp:cNvGraphicFramePr>
+              <a:graphicFrameLocks xmlns:a="http://schemas.openxmlformats.org/drawingml/2006/main" noChangeAspect="1"/>
+            </wp:cNvGraphicFramePr>
+            <a:graphic xmlns:a="http://schemas.openxmlformats.org/drawingml/2006/main">
+              <a:graphicData uri="http://schemas.openxmlformats.org/drawingml/2006/picture">
+                <pic:pic xmlns:pic="http://schemas.openxmlformats.org/drawingml/2006/picture">
+                  <pic:nvPicPr>
+                    <pic:cNvPr id="1860025404" name=""/>
+                    <pic:cNvPicPr/>
+                  </pic:nvPicPr>
+                  <pic:blipFill>
+                    <a:blip r:embed="rId73"/>
+                    <a:stretch>
+                      <a:fillRect/>
+                    </a:stretch>
+                  </pic:blipFill>
+                  <pic:spPr>
+                    <a:xfrm>
+                      <a:off x="0" y="0"/>
+                      <a:ext cx="5943600" cy="3798570"/>
+                    </a:xfrm>
+                    <a:prstGeom prst="rect">
+                      <a:avLst/>
+                    </a:prstGeom>
+                  </pic:spPr>
+                </pic:pic>
+              </a:graphicData>
+            </a:graphic>
+          </wp:inline>
+        </w:drawing>
+      </w:r>
+    </w:p>
+    <w:p>
+      <w:r>
+        <w:t>Admin Role can create role:</w:t>
+      </w:r>
+    </w:p>
+    <w:p>
+      <w:r>
+        <w:rPr>
+          <w:noProof/>
+        </w:rPr>
+        <w:drawing>
+          <wp:inline distT="0" distB="0" distL="0" distR="0" wp14:anchorId="6A91B3F5" wp14:editId="08615E57">
+            <wp:extent cx="5943600" cy="1134745"/>
+            <wp:effectExtent l="0" t="0" r="0" b="8255"/>
+            <wp:docPr id="831086517" name="Picture 1"/>
+            <wp:cNvGraphicFramePr>
+              <a:graphicFrameLocks xmlns:a="http://schemas.openxmlformats.org/drawingml/2006/main" noChangeAspect="1"/>
+            </wp:cNvGraphicFramePr>
+            <a:graphic xmlns:a="http://schemas.openxmlformats.org/drawingml/2006/main">
+              <a:graphicData uri="http://schemas.openxmlformats.org/drawingml/2006/picture">
+                <pic:pic xmlns:pic="http://schemas.openxmlformats.org/drawingml/2006/picture">
+                  <pic:nvPicPr>
+                    <pic:cNvPr id="831086517" name=""/>
+                    <pic:cNvPicPr/>
+                  </pic:nvPicPr>
+                  <pic:blipFill>
+                    <a:blip r:embed="rId74"/>
+                    <a:stretch>
+                      <a:fillRect/>
+                    </a:stretch>
+                  </pic:blipFill>
+                  <pic:spPr>
+                    <a:xfrm>
+                      <a:off x="0" y="0"/>
+                      <a:ext cx="5943600" cy="1134745"/>
+                    </a:xfrm>
+                    <a:prstGeom prst="rect">
+                      <a:avLst/>
+                    </a:prstGeom>
+                  </pic:spPr>
+                </pic:pic>
+              </a:graphicData>
+            </a:graphic>
+          </wp:inline>
+        </w:drawing>
+      </w:r>
+    </w:p>
+    <w:p>
+      <w:pPr>
+        <w:rPr>
+          <w:noProof/>
+        </w:rPr>
+      </w:pPr>
+    </w:p>
+    <w:p>
+      <w:pPr>
+        <w:rPr>
+          <w:noProof/>
+        </w:rPr>
+      </w:pPr>
+      <w:r>
+        <w:rPr>
+          <w:noProof/>
+        </w:rPr>
+        <w:drawing>
+          <wp:inline distT="0" distB="0" distL="0" distR="0" wp14:anchorId="0CC84E24" wp14:editId="7B6A77EB">
+            <wp:extent cx="3505200" cy="752475"/>
+            <wp:effectExtent l="0" t="0" r="0" b="9525"/>
+            <wp:docPr id="2020819423" name="Picture 1"/>
+            <wp:cNvGraphicFramePr>
+              <a:graphicFrameLocks xmlns:a="http://schemas.openxmlformats.org/drawingml/2006/main" noChangeAspect="1"/>
+            </wp:cNvGraphicFramePr>
+            <a:graphic xmlns:a="http://schemas.openxmlformats.org/drawingml/2006/main">
+              <a:graphicData uri="http://schemas.openxmlformats.org/drawingml/2006/picture">
+                <pic:pic xmlns:pic="http://schemas.openxmlformats.org/drawingml/2006/picture">
+                  <pic:nvPicPr>
+                    <pic:cNvPr id="2020819423" name=""/>
+                    <pic:cNvPicPr/>
+                  </pic:nvPicPr>
+                  <pic:blipFill>
+                    <a:blip r:embed="rId75"/>
+                    <a:stretch>
+                      <a:fillRect/>
+                    </a:stretch>
+                  </pic:blipFill>
+                  <pic:spPr>
+                    <a:xfrm>
+                      <a:off x="0" y="0"/>
+                      <a:ext cx="3505200" cy="752475"/>
+                    </a:xfrm>
+                    <a:prstGeom prst="rect">
+                      <a:avLst/>
+                    </a:prstGeom>
+                  </pic:spPr>
+                </pic:pic>
+              </a:graphicData>
+            </a:graphic>
+          </wp:inline>
+        </w:drawing>
+      </w:r>
+      <w:r>
+        <w:rPr>
+          <w:noProof/>
+        </w:rPr>
+        <w:t xml:space="preserve"> </w:t>
+      </w:r>
+    </w:p>
+    <w:p>
+      <w:r>
+        <w:rPr>
+          <w:noProof/>
+        </w:rPr>
+        <w:lastRenderedPageBreak/>
+        <w:drawing>
+          <wp:inline distT="0" distB="0" distL="0" distR="0" wp14:anchorId="7F771B1A" wp14:editId="1757B925">
+            <wp:extent cx="3114675" cy="1666875"/>
+            <wp:effectExtent l="0" t="0" r="9525" b="9525"/>
+            <wp:docPr id="780246792" name="Picture 1"/>
+            <wp:cNvGraphicFramePr>
+              <a:graphicFrameLocks xmlns:a="http://schemas.openxmlformats.org/drawingml/2006/main" noChangeAspect="1"/>
+            </wp:cNvGraphicFramePr>
+            <a:graphic xmlns:a="http://schemas.openxmlformats.org/drawingml/2006/main">
+              <a:graphicData uri="http://schemas.openxmlformats.org/drawingml/2006/picture">
+                <pic:pic xmlns:pic="http://schemas.openxmlformats.org/drawingml/2006/picture">
+                  <pic:nvPicPr>
+                    <pic:cNvPr id="780246792" name=""/>
+                    <pic:cNvPicPr/>
+                  </pic:nvPicPr>
+                  <pic:blipFill>
+                    <a:blip r:embed="rId76"/>
+                    <a:stretch>
+                      <a:fillRect/>
+                    </a:stretch>
+                  </pic:blipFill>
+                  <pic:spPr>
+                    <a:xfrm>
+                      <a:off x="0" y="0"/>
+                      <a:ext cx="3114675" cy="1666875"/>
+                    </a:xfrm>
+                    <a:prstGeom prst="rect">
+                      <a:avLst/>
+                    </a:prstGeom>
+                  </pic:spPr>
+                </pic:pic>
+              </a:graphicData>
+            </a:graphic>
+          </wp:inline>
+        </w:drawing>
+      </w:r>
+    </w:p>
+    <w:p>
+      <w:pPr>
+        <w:pStyle w:val="Heading2"/>
+      </w:pPr>
+      <w:r>
+        <w:t>Implement Custom Login:</w:t>
+      </w:r>
+    </w:p>
+    <w:p>
+      <w:pPr>
+        <w:rPr>
+          <w:noProof/>
+        </w:rPr>
+      </w:pPr>
+      <w:r>
+        <w:rPr>
+          <w:noProof/>
+        </w:rPr>
+        <w:drawing>
+          <wp:inline distT="0" distB="0" distL="0" distR="0" wp14:anchorId="3D5E11A8" wp14:editId="290EE32D">
+            <wp:extent cx="5943600" cy="3206115"/>
+            <wp:effectExtent l="0" t="0" r="0" b="0"/>
+            <wp:docPr id="1642483941" name="Picture 1"/>
+            <wp:cNvGraphicFramePr>
+              <a:graphicFrameLocks xmlns:a="http://schemas.openxmlformats.org/drawingml/2006/main" noChangeAspect="1"/>
+            </wp:cNvGraphicFramePr>
+            <a:graphic xmlns:a="http://schemas.openxmlformats.org/drawingml/2006/main">
+              <a:graphicData uri="http://schemas.openxmlformats.org/drawingml/2006/picture">
+                <pic:pic xmlns:pic="http://schemas.openxmlformats.org/drawingml/2006/picture">
+                  <pic:nvPicPr>
+                    <pic:cNvPr id="1642483941" name=""/>
+                    <pic:cNvPicPr/>
+                  </pic:nvPicPr>
+                  <pic:blipFill>
+                    <a:blip r:embed="rId77"/>
+                    <a:stretch>
+                      <a:fillRect/>
+                    </a:stretch>
+                  </pic:blipFill>
+                  <pic:spPr>
+                    <a:xfrm>
+                      <a:off x="0" y="0"/>
+                      <a:ext cx="5943600" cy="3206115"/>
+                    </a:xfrm>
+                    <a:prstGeom prst="rect">
+                      <a:avLst/>
+                    </a:prstGeom>
+                  </pic:spPr>
+                </pic:pic>
+              </a:graphicData>
+            </a:graphic>
+          </wp:inline>
+        </w:drawing>
+      </w:r>
+      <w:r>
+        <w:rPr>
+          <w:noProof/>
+        </w:rPr>
+        <w:t xml:space="preserve"> </w:t>
+      </w:r>
+    </w:p>
+    <w:p>
+      <w:pPr>
+        <w:rPr>
+          <w:b/>
+          <w:bCs/>
+          <w:noProof/>
+        </w:rPr>
+      </w:pPr>
+      <w:r>
+        <w:rPr>
+          <w:b/>
+          <w:bCs/>
+          <w:noProof/>
+        </w:rPr>
+        <w:t>UserController.java</w:t>
+      </w:r>
+    </w:p>
+    <w:p>
+      <w:pPr>
+        <w:rPr>
+          <w:noProof/>
+        </w:rPr>
+      </w:pPr>
+      <w:r>
+        <w:rPr>
+          <w:noProof/>
+        </w:rPr>
+        <w:lastRenderedPageBreak/>
+        <w:drawing>
+          <wp:inline distT="0" distB="0" distL="0" distR="0" wp14:anchorId="01DA6C46" wp14:editId="2C0A1FEF">
+            <wp:extent cx="5943600" cy="4769485"/>
+            <wp:effectExtent l="0" t="0" r="0" b="0"/>
+            <wp:docPr id="1531027531" name="Picture 1"/>
+            <wp:cNvGraphicFramePr>
+              <a:graphicFrameLocks xmlns:a="http://schemas.openxmlformats.org/drawingml/2006/main" noChangeAspect="1"/>
+            </wp:cNvGraphicFramePr>
+            <a:graphic xmlns:a="http://schemas.openxmlformats.org/drawingml/2006/main">
+              <a:graphicData uri="http://schemas.openxmlformats.org/drawingml/2006/picture">
+                <pic:pic xmlns:pic="http://schemas.openxmlformats.org/drawingml/2006/picture">
+                  <pic:nvPicPr>
+                    <pic:cNvPr id="1531027531" name=""/>
+                    <pic:cNvPicPr/>
+                  </pic:nvPicPr>
+                  <pic:blipFill>
+                    <a:blip r:embed="rId78"/>
+                    <a:stretch>
+                      <a:fillRect/>
+                    </a:stretch>
+                  </pic:blipFill>
+                  <pic:spPr>
+                    <a:xfrm>
+                      <a:off x="0" y="0"/>
+                      <a:ext cx="5943600" cy="4769485"/>
+                    </a:xfrm>
+                    <a:prstGeom prst="rect">
+                      <a:avLst/>
+                    </a:prstGeom>
+                  </pic:spPr>
+                </pic:pic>
+              </a:graphicData>
+            </a:graphic>
+          </wp:inline>
+        </w:drawing>
+      </w:r>
+    </w:p>
+    <w:p>
+      <w:pPr>
+        <w:rPr>
+          <w:b/>
+          <w:bCs/>
+          <w:noProof/>
+        </w:rPr>
+      </w:pPr>
+      <w:r>
+        <w:rPr>
+          <w:b/>
+          <w:bCs/>
+          <w:noProof/>
+        </w:rPr>
+        <w:t xml:space="preserve">SecurityService Interface: </w:t>
+      </w:r>
+    </w:p>
+    <w:p>
+      <w:pPr>
+        <w:rPr>
+          <w:noProof/>
+        </w:rPr>
+      </w:pPr>
+      <w:r>
+        <w:rPr>
+          <w:noProof/>
+        </w:rPr>
+        <w:drawing>
+          <wp:inline distT="0" distB="0" distL="0" distR="0" wp14:anchorId="27DBAB7E" wp14:editId="50ABF536">
+            <wp:extent cx="5943600" cy="1285875"/>
+            <wp:effectExtent l="0" t="0" r="0" b="9525"/>
+            <wp:docPr id="1400258534" name="Picture 1"/>
+            <wp:cNvGraphicFramePr>
+              <a:graphicFrameLocks xmlns:a="http://schemas.openxmlformats.org/drawingml/2006/main" noChangeAspect="1"/>
+            </wp:cNvGraphicFramePr>
+            <a:graphic xmlns:a="http://schemas.openxmlformats.org/drawingml/2006/main">
+              <a:graphicData uri="http://schemas.openxmlformats.org/drawingml/2006/picture">
+                <pic:pic xmlns:pic="http://schemas.openxmlformats.org/drawingml/2006/picture">
+                  <pic:nvPicPr>
+                    <pic:cNvPr id="1400258534" name=""/>
+                    <pic:cNvPicPr/>
+                  </pic:nvPicPr>
+                  <pic:blipFill>
+                    <a:blip r:embed="rId79"/>
+                    <a:stretch>
+                      <a:fillRect/>
+                    </a:stretch>
+                  </pic:blipFill>
+                  <pic:spPr>
+                    <a:xfrm>
+                      <a:off x="0" y="0"/>
+                      <a:ext cx="5943600" cy="1285875"/>
+                    </a:xfrm>
+                    <a:prstGeom prst="rect">
+                      <a:avLst/>
+                    </a:prstGeom>
+                  </pic:spPr>
+                </pic:pic>
+              </a:graphicData>
+            </a:graphic>
+          </wp:inline>
+        </w:drawing>
+      </w:r>
+      <w:r>
+        <w:rPr>
+          <w:noProof/>
+        </w:rPr>
+        <w:t xml:space="preserve"> </w:t>
+      </w:r>
+    </w:p>
+    <w:p>
+      <w:pPr>
+        <w:rPr>
+          <w:b/>
+          <w:bCs/>
+          <w:noProof/>
+        </w:rPr>
+      </w:pPr>
+      <w:r>
+        <w:rPr>
+          <w:b/>
+          <w:bCs/>
+          <w:noProof/>
+        </w:rPr>
+        <w:t>SecurityServiceImpl.java:</w:t>
+      </w:r>
+    </w:p>
+    <w:p>
+      <w:pPr>
+        <w:rPr>
+          <w:noProof/>
+        </w:rPr>
+      </w:pPr>
+      <w:r>
+        <w:rPr>
+          <w:noProof/>
+        </w:rPr>
+        <w:lastRenderedPageBreak/>
+        <w:drawing>
+          <wp:inline distT="0" distB="0" distL="0" distR="0" wp14:anchorId="60B510BD" wp14:editId="6399DA7D">
+            <wp:extent cx="5943600" cy="4877435"/>
+            <wp:effectExtent l="0" t="0" r="0" b="0"/>
+            <wp:docPr id="4842623" name="Picture 1"/>
+            <wp:cNvGraphicFramePr>
+              <a:graphicFrameLocks xmlns:a="http://schemas.openxmlformats.org/drawingml/2006/main" noChangeAspect="1"/>
+            </wp:cNvGraphicFramePr>
+            <a:graphic xmlns:a="http://schemas.openxmlformats.org/drawingml/2006/main">
+              <a:graphicData uri="http://schemas.openxmlformats.org/drawingml/2006/picture">
+                <pic:pic xmlns:pic="http://schemas.openxmlformats.org/drawingml/2006/picture">
+                  <pic:nvPicPr>
+                    <pic:cNvPr id="4842623" name=""/>
+                    <pic:cNvPicPr/>
+                  </pic:nvPicPr>
+                  <pic:blipFill>
+                    <a:blip r:embed="rId80"/>
+                    <a:stretch>
+                      <a:fillRect/>
+                    </a:stretch>
+                  </pic:blipFill>
+                  <pic:spPr>
+                    <a:xfrm>
+                      <a:off x="0" y="0"/>
+                      <a:ext cx="5943600" cy="4877435"/>
+                    </a:xfrm>
+                    <a:prstGeom prst="rect">
+                      <a:avLst/>
+                    </a:prstGeom>
+                  </pic:spPr>
+                </pic:pic>
+              </a:graphicData>
+            </a:graphic>
+          </wp:inline>
+        </w:drawing>
+      </w:r>
+    </w:p>
+    <w:p>
+      <w:pPr>
+        <w:rPr>
+          <w:b/>
+          <w:bCs/>
+        </w:rPr>
+      </w:pPr>
+      <w:r>
+        <w:rPr>
+          <w:b/>
+          <w:bCs/>
+        </w:rPr>
+        <w:t>WebSecurityConfig</w:t>
+      </w:r>
+      <w:r>
+        <w:rPr>
+          <w:b/>
+          <w:bCs/>
+        </w:rPr>
+        <w:t>.java</w:t>
+      </w:r>
+      <w:r>
+        <w:rPr>
+          <w:b/>
+          <w:bCs/>
+        </w:rPr>
+        <w:t>:</w:t>
+      </w:r>
+    </w:p>
+    <w:p>
+      <w:pPr>
+        <w:rPr>
+          <w:noProof/>
+        </w:rPr>
+      </w:pPr>
+      <w:r>
+        <w:rPr>
+          <w:noProof/>
+        </w:rPr>
+        <w:lastRenderedPageBreak/>
+        <w:drawing>
+          <wp:inline distT="0" distB="0" distL="0" distR="0" wp14:anchorId="0BA606A4" wp14:editId="1322DCD0">
+            <wp:extent cx="5943600" cy="3597275"/>
+            <wp:effectExtent l="0" t="0" r="0" b="3175"/>
+            <wp:docPr id="288779573" name="Picture 1"/>
+            <wp:cNvGraphicFramePr>
+              <a:graphicFrameLocks xmlns:a="http://schemas.openxmlformats.org/drawingml/2006/main" noChangeAspect="1"/>
+            </wp:cNvGraphicFramePr>
+            <a:graphic xmlns:a="http://schemas.openxmlformats.org/drawingml/2006/main">
+              <a:graphicData uri="http://schemas.openxmlformats.org/drawingml/2006/picture">
+                <pic:pic xmlns:pic="http://schemas.openxmlformats.org/drawingml/2006/picture">
+                  <pic:nvPicPr>
+                    <pic:cNvPr id="288779573" name=""/>
+                    <pic:cNvPicPr/>
+                  </pic:nvPicPr>
+                  <pic:blipFill>
+                    <a:blip r:embed="rId81"/>
+                    <a:stretch>
+                      <a:fillRect/>
+                    </a:stretch>
+                  </pic:blipFill>
+                  <pic:spPr>
+                    <a:xfrm>
+                      <a:off x="0" y="0"/>
+                      <a:ext cx="5943600" cy="3597275"/>
+                    </a:xfrm>
+                    <a:prstGeom prst="rect">
+                      <a:avLst/>
+                    </a:prstGeom>
+                  </pic:spPr>
+                </pic:pic>
+              </a:graphicData>
+            </a:graphic>
+          </wp:inline>
+        </w:drawing>
+      </w:r>
+      <w:r>
+        <w:rPr>
+          <w:noProof/>
+        </w:rPr>
+        <w:t xml:space="preserve"> </w:t>
+      </w:r>
+      <w:r>
+        <w:rPr>
+          <w:noProof/>
+        </w:rPr>
+        <w:drawing>
+          <wp:inline distT="0" distB="0" distL="0" distR="0" wp14:anchorId="75BFFCCB" wp14:editId="649DC385">
+            <wp:extent cx="5943600" cy="3017520"/>
+            <wp:effectExtent l="0" t="0" r="0" b="0"/>
+            <wp:docPr id="1376793802" name="Picture 1"/>
+            <wp:cNvGraphicFramePr>
+              <a:graphicFrameLocks xmlns:a="http://schemas.openxmlformats.org/drawingml/2006/main" noChangeAspect="1"/>
+            </wp:cNvGraphicFramePr>
+            <a:graphic xmlns:a="http://schemas.openxmlformats.org/drawingml/2006/main">
+              <a:graphicData uri="http://schemas.openxmlformats.org/drawingml/2006/picture">
+                <pic:pic xmlns:pic="http://schemas.openxmlformats.org/drawingml/2006/picture">
+                  <pic:nvPicPr>
+                    <pic:cNvPr id="1376793802" name=""/>
+                    <pic:cNvPicPr/>
+                  </pic:nvPicPr>
+                  <pic:blipFill>
+                    <a:blip r:embed="rId82"/>
+                    <a:stretch>
+                      <a:fillRect/>
+                    </a:stretch>
+                  </pic:blipFill>
+                  <pic:spPr>
+                    <a:xfrm>
+                      <a:off x="0" y="0"/>
+                      <a:ext cx="5943600" cy="3017520"/>
+                    </a:xfrm>
+                    <a:prstGeom prst="rect">
+                      <a:avLst/>
+                    </a:prstGeom>
+                  </pic:spPr>
+                </pic:pic>
+              </a:graphicData>
+            </a:graphic>
+          </wp:inline>
+        </w:drawing>
+      </w:r>
+    </w:p>
+    <w:p>
+      <w:pPr>
+        <w:rPr>
+          <w:b/>
+          <w:bCs/>
+        </w:rPr>
+      </w:pPr>
+      <w:r>
+        <w:rPr>
+          <w:b/>
+          <w:bCs/>
+        </w:rPr>
+        <w:t xml:space="preserve">Custom </w:t>
+      </w:r>
+      <w:r>
+        <w:rPr>
+          <w:b/>
+          <w:bCs/>
+        </w:rPr>
+        <w:t>UserDetailsServiceImpl</w:t>
+      </w:r>
+      <w:r>
+        <w:rPr>
+          <w:b/>
+          <w:bCs/>
+        </w:rPr>
+        <w:t>.java:</w:t>
+      </w:r>
+    </w:p>
+    <w:p>
+      <w:pPr>
+        <w:rPr>
+          <w:b/>
+          <w:bCs/>
+        </w:rPr>
+      </w:pPr>
+      <w:r>
+        <w:rPr>
+          <w:noProof/>
+        </w:rPr>
+        <w:lastRenderedPageBreak/>
+        <w:drawing>
+          <wp:inline distT="0" distB="0" distL="0" distR="0" wp14:anchorId="2CE9EABF" wp14:editId="6A83182D">
+            <wp:extent cx="5943600" cy="4773295"/>
+            <wp:effectExtent l="0" t="0" r="0" b="8255"/>
+            <wp:docPr id="191417238" name="Picture 1"/>
+            <wp:cNvGraphicFramePr>
+              <a:graphicFrameLocks xmlns:a="http://schemas.openxmlformats.org/drawingml/2006/main" noChangeAspect="1"/>
+            </wp:cNvGraphicFramePr>
+            <a:graphic xmlns:a="http://schemas.openxmlformats.org/drawingml/2006/main">
+              <a:graphicData uri="http://schemas.openxmlformats.org/drawingml/2006/picture">
+                <pic:pic xmlns:pic="http://schemas.openxmlformats.org/drawingml/2006/picture">
+                  <pic:nvPicPr>
+                    <pic:cNvPr id="191417238" name=""/>
+                    <pic:cNvPicPr/>
+                  </pic:nvPicPr>
+                  <pic:blipFill>
+                    <a:blip r:embed="rId83"/>
+                    <a:stretch>
+                      <a:fillRect/>
+                    </a:stretch>
+                  </pic:blipFill>
+                  <pic:spPr>
+                    <a:xfrm>
+                      <a:off x="0" y="0"/>
+                      <a:ext cx="5943600" cy="4773295"/>
+                    </a:xfrm>
+                    <a:prstGeom prst="rect">
+                      <a:avLst/>
+                    </a:prstGeom>
+                  </pic:spPr>
+                </pic:pic>
+              </a:graphicData>
+            </a:graphic>
+          </wp:inline>
+        </w:drawing>
+      </w:r>
+    </w:p>
+    <w:p>
+      <w:pPr>
+        <w:rPr>
+          <w:b/>
+          <w:bCs/>
+        </w:rPr>
+      </w:pPr>
+      <w:r>
+        <w:rPr>
+          <w:noProof/>
+        </w:rPr>
+        <w:drawing>
+          <wp:inline distT="0" distB="0" distL="0" distR="0" wp14:anchorId="48BD0594" wp14:editId="168BE6D8">
+            <wp:extent cx="2724150" cy="1876425"/>
+            <wp:effectExtent l="0" t="0" r="0" b="9525"/>
+            <wp:docPr id="1750492431" name="Picture 1"/>
+            <wp:cNvGraphicFramePr>
+              <a:graphicFrameLocks xmlns:a="http://schemas.openxmlformats.org/drawingml/2006/main" noChangeAspect="1"/>
+            </wp:cNvGraphicFramePr>
+            <a:graphic xmlns:a="http://schemas.openxmlformats.org/drawingml/2006/main">
+              <a:graphicData uri="http://schemas.openxmlformats.org/drawingml/2006/picture">
+                <pic:pic xmlns:pic="http://schemas.openxmlformats.org/drawingml/2006/picture">
+                  <pic:nvPicPr>
+                    <pic:cNvPr id="1750492431" name=""/>
+                    <pic:cNvPicPr/>
+                  </pic:nvPicPr>
+                  <pic:blipFill>
+                    <a:blip r:embed="rId84"/>
+                    <a:stretch>
+                      <a:fillRect/>
+                    </a:stretch>
+                  </pic:blipFill>
+                  <pic:spPr>
+                    <a:xfrm>
+                      <a:off x="0" y="0"/>
+                      <a:ext cx="2724150" cy="1876425"/>
+                    </a:xfrm>
+                    <a:prstGeom prst="rect">
+                      <a:avLst/>
+                    </a:prstGeom>
+                  </pic:spPr>
+                </pic:pic>
+              </a:graphicData>
+            </a:graphic>
+          </wp:inline>
+        </w:drawing>
+      </w:r>
+    </w:p>
+    <w:p>
+      <w:pPr>
+        <w:rPr>
+          <w:b/>
+          <w:bCs/>
+        </w:rPr>
+      </w:pPr>
+    </w:p>
+    <w:p/>
+    <w:p/>
     <w:p>
       <w:pPr>
         <w:rPr>

</xml_diff>